<commit_message>
docs: sync HIT report content into attachment3 and clean references
Agent-Logs-Url: https://github.com/Love-Luo-Tianyi/Academic-paper-tracking-assistant/sessions/00992595-982b-45e5-97d6-4314f92d8002

Co-authored-by: Love-Luo-Tianyi <233744119+Love-Luo-Tianyi@users.noreply.github.com>
</commit_message>
<xml_diff>
--- a/1_哈尔滨工业大学报告.docx
+++ b/1_哈尔滨工业大学报告.docx
@@ -1527,7 +1527,7 @@
           <w:b w:val="0"/>
           <w:sz w:val="21"/>
         </w:rPr>
-        <w:t>[1] Xun Liang, Jiawei Yang, et al. Survey X: Academic Survey Automation via Large Language Models. 2025.</w:t>
+        <w:t>[1] arXiv. arXiv Submission Rate Statistics[EB/OL]. https://arxiv.org/stats/monthly_submissions, 2026-04-21.</w:t>
       </w:r>
     </w:p>
     <w:p>
@@ -1542,7 +1542,7 @@
           <w:b w:val="0"/>
           <w:sz w:val="21"/>
         </w:rPr>
-        <w:t>[2] Zhen Qin, Daoyuan Chen, et al. The Synergy between Data and Multi-Modal Large Language Models: A Survey from Co-Development Perspective. 2024.</w:t>
+        <w:t>[2] Bai J, Bai S, Chu Y, et al. Qwen Technical Report[J/OL]. arXiv:2309.16609, 2023.</w:t>
       </w:r>
     </w:p>
     <w:p>
@@ -1557,37 +1557,7 @@
           <w:b w:val="0"/>
           <w:sz w:val="21"/>
         </w:rPr>
-        <w:t>[3] Tom B. Brown, Benjamin Mann, et al. Language Models are Few-Shot Learners. NeurIPS 2020.</w:t>
-      </w:r>
-    </w:p>
-    <w:p>
-      <w:pPr>
-        <w:spacing w:before="0" w:after="40"/>
-        <w:ind w:firstLine="420"/>
-        <w:jc w:val="both"/>
-      </w:pPr>
-      <w:r>
-        <w:rPr>
-          <w:rFonts w:ascii="宋体" w:hAnsi="宋体" w:eastAsia="宋体"/>
-          <w:b w:val="0"/>
-          <w:sz w:val="21"/>
-        </w:rPr>
-        <w:t>[4] Caroline Ochuko Alordiah, Mercy Afe Osagiede, et al. Awareness, knowledge, and utilisation of online digital tools for literature review in educational research. 2023.</w:t>
-      </w:r>
-    </w:p>
-    <w:p>
-      <w:pPr>
-        <w:spacing w:before="0" w:after="40"/>
-        <w:ind w:firstLine="420"/>
-        <w:jc w:val="both"/>
-      </w:pPr>
-      <w:r>
-        <w:rPr>
-          <w:rFonts w:ascii="宋体" w:hAnsi="宋体" w:eastAsia="宋体"/>
-          <w:b w:val="0"/>
-          <w:sz w:val="21"/>
-        </w:rPr>
-        <w:t>[5] 陈皓. 大模型时代的AI工程实践[M]. 机械工业出版社, 2024.</w:t>
+        <w:t>[3] Guo D, Yang D, Zhang H, et al. DeepSeek-R1: Incentivizing Reasoning Capability in LLMs via Reinforcement Learning[J/OL]. arXiv:2501.12948, 2025.</w:t>
       </w:r>
     </w:p>
     <w:sectPr>

</xml_diff>